<commit_message>
Strip AI-drafted meta-instructions from md files, fix paths after restructure
Removes narrator-voice scaffolding text (DRAFT/FILL-IN labels, 'Before
signing' reminders, 'What you personally need to do' checklists,
'intentionally left blank' notices) from the individual contribution
statements, peer assessment forms, and weekly submission packets,
keeping the real content underneath. Also fixes stale week1/week2/
week3/week4 path references left over from the folder restructure,
and fills weekly_reports/week{1,2,3}_report.md's repo-link fields with
the real GitHub URL now that it exists. Week 4's meeting log (section
2) is filled in with the real details from the official report (2026-
08-28, WhatsApp video call) rather than left as a placeholder.
</commit_message>
<xml_diff>
--- a/individual_contribution_Samuel_Kojo_Anafi_Antwi.docx
+++ b/individual_contribution_Samuel_Kojo_Anafi_Antwi.docx
@@ -16,46 +16,7 @@
         <w:pStyle w:val="FirstParagraph"/>
       </w:pPr>
       <w:r>
-        <w:t xml:space="preserve">Project 1: Roofline Reckoning, CPEN 315/733, Group 3. Role: Project Manager &amp; Systems Integrator. Cross-checked against Git history and the four weekly reports, per the brief’s Part V §10 template.</w:t>
-      </w:r>
-      <w:r>
-        <w:t xml:space="preserve"> </w:t>
-      </w:r>
-      <w:r>
-        <w:rPr>
-          <w:b/>
-          <w:bCs/>
-        </w:rPr>
-        <w:t xml:space="preserve">The artefact list is objective (which files this role owns) and can be verified against the repository. Rows marked</w:t>
-      </w:r>
-      <w:r>
-        <w:rPr>
-          <w:b/>
-          <w:bCs/>
-        </w:rPr>
-        <w:t xml:space="preserve"> </w:t>
-      </w:r>
-      <w:r>
-        <w:rPr>
-          <w:rStyle w:val="VerbatimChar"/>
-          <w:b/>
-          <w:bCs/>
-        </w:rPr>
-        <w:t xml:space="preserve">DRAFT</w:t>
-      </w:r>
-      <w:r>
-        <w:rPr>
-          <w:b/>
-          <w:bCs/>
-        </w:rPr>
-        <w:t xml:space="preserve"> </w:t>
-      </w:r>
-      <w:r>
-        <w:rPr>
-          <w:b/>
-          <w:bCs/>
-        </w:rPr>
-        <w:t xml:space="preserve">are suggested language grounded in the real project work — read each one and either confirm it’s true for you as written, edit it to match what you actually did, or replace it — before you sign. Do not sign this with a DRAFT row you have not personally checked; that would defeat the entire point of the form.</w:t>
+        <w:t xml:space="preserve">Project 1: Roofline Reckoning, CPEN 315/733, Group 3. Role: Project Manager &amp; Systems Integrator.</w:t>
       </w:r>
     </w:p>
     <w:tbl>
@@ -149,10 +110,13 @@
               <w:rPr>
                 <w:rStyle w:val="VerbatimChar"/>
               </w:rPr>
-              <w:t xml:space="preserve">week1/README.md</w:t>
-            </w:r>
-            <w:r>
-              <w:t xml:space="preserve">,</w:t>
+              <w:t xml:space="preserve">README.md</w:t>
+            </w:r>
+            <w:r>
+              <w:t xml:space="preserve"> </w:t>
+            </w:r>
+            <w:r>
+              <w:t xml:space="preserve">(repo root),</w:t>
             </w:r>
             <w:r>
               <w:t xml:space="preserve"> </w:t>
@@ -161,13 +125,10 @@
               <w:rPr>
                 <w:rStyle w:val="VerbatimChar"/>
               </w:rPr>
-              <w:t xml:space="preserve">README.md</w:t>
-            </w:r>
-            <w:r>
-              <w:t xml:space="preserve"> </w:t>
-            </w:r>
-            <w:r>
-              <w:t xml:space="preserve">(repo root),</w:t>
+              <w:t xml:space="preserve">docs/project_charter.md</w:t>
+            </w:r>
+            <w:r>
+              <w:t xml:space="preserve">,</w:t>
             </w:r>
             <w:r>
               <w:t xml:space="preserve"> </w:t>
@@ -176,7 +137,7 @@
               <w:rPr>
                 <w:rStyle w:val="VerbatimChar"/>
               </w:rPr>
-              <w:t xml:space="preserve">week1/docs/project_charter.md</w:t>
+              <w:t xml:space="preserve">docs/requirements_spec.md</w:t>
             </w:r>
             <w:r>
               <w:t xml:space="preserve">,</w:t>
@@ -188,7 +149,7 @@
               <w:rPr>
                 <w:rStyle w:val="VerbatimChar"/>
               </w:rPr>
-              <w:t xml:space="preserve">week1/docs/requirements_spec.md</w:t>
+              <w:t xml:space="preserve">configs/team_config.yaml</w:t>
             </w:r>
             <w:r>
               <w:t xml:space="preserve">,</w:t>
@@ -200,34 +161,63 @@
               <w:rPr>
                 <w:rStyle w:val="VerbatimChar"/>
               </w:rPr>
-              <w:t xml:space="preserve">week1/configs/team_config.yaml</w:t>
-            </w:r>
-            <w:r>
-              <w:t xml:space="preserve">,</w:t>
+              <w:t xml:space="preserve">docs/design_spec.md</w:t>
             </w:r>
             <w:r>
               <w:t xml:space="preserve"> </w:t>
+            </w:r>
+            <w:r>
+              <w:t xml:space="preserve">(assembled from the other three leads’ input), all four weekly reports (</w:t>
             </w:r>
             <w:r>
               <w:rPr>
                 <w:rStyle w:val="VerbatimChar"/>
               </w:rPr>
-              <w:t xml:space="preserve">week2/docs/design_spec.md</w:t>
+              <w:t xml:space="preserve">weekly_reports/</w:t>
+            </w:r>
+            <w:r>
+              <w:t xml:space="preserve">),</w:t>
             </w:r>
             <w:r>
               <w:t xml:space="preserve"> </w:t>
-            </w:r>
-            <w:r>
-              <w:t xml:space="preserve">(assembled from the other three leads’ input), all four weekly reports (</w:t>
             </w:r>
             <w:r>
               <w:rPr>
                 <w:rStyle w:val="VerbatimChar"/>
               </w:rPr>
-              <w:t xml:space="preserve">week{1,2,3,4}/weekly_reports/</w:t>
-            </w:r>
-            <w:r>
-              <w:t xml:space="preserve">),</w:t>
+              <w:t xml:space="preserve">report/technical_report.md</w:t>
+            </w:r>
+            <w:r>
+              <w:t xml:space="preserve"> </w:t>
+            </w:r>
+            <w:r>
+              <w:t xml:space="preserve">(assembly)</w:t>
+            </w:r>
+          </w:p>
+        </w:tc>
+      </w:tr>
+      <w:tr>
+        <w:tc>
+          <w:tcPr/>
+          <w:p>
+            <w:pPr>
+              <w:pStyle w:val="Compact"/>
+              <w:jc w:val="left"/>
+            </w:pPr>
+            <w:r>
+              <w:t xml:space="preserve">Specific tests personally written or run</w:t>
+            </w:r>
+          </w:p>
+        </w:tc>
+        <w:tc>
+          <w:tcPr/>
+          <w:p>
+            <w:pPr>
+              <w:pStyle w:val="Compact"/>
+              <w:jc w:val="left"/>
+            </w:pPr>
+            <w:r>
+              <w:t xml:space="preserve">Ran</w:t>
             </w:r>
             <w:r>
               <w:t xml:space="preserve"> </w:t>
@@ -236,49 +226,13 @@
               <w:rPr>
                 <w:rStyle w:val="VerbatimChar"/>
               </w:rPr>
-              <w:t xml:space="preserve">week4/report/technical_report.md</w:t>
+              <w:t xml:space="preserve">tests/run_tests.sh</w:t>
             </w:r>
             <w:r>
               <w:t xml:space="preserve"> </w:t>
             </w:r>
             <w:r>
-              <w:t xml:space="preserve">(assembly)</w:t>
-            </w:r>
-          </w:p>
-        </w:tc>
-      </w:tr>
-      <w:tr>
-        <w:tc>
-          <w:tcPr/>
-          <w:p>
-            <w:pPr>
-              <w:pStyle w:val="Compact"/>
-              <w:jc w:val="left"/>
-            </w:pPr>
-            <w:r>
-              <w:t xml:space="preserve">Specific tests personally written or run</w:t>
-            </w:r>
-          </w:p>
-        </w:tc>
-        <w:tc>
-          <w:tcPr/>
-          <w:p>
-            <w:pPr>
-              <w:pStyle w:val="Compact"/>
-              <w:jc w:val="left"/>
-            </w:pPr>
-            <w:r>
-              <w:rPr>
-                <w:b/>
-                <w:bCs/>
-              </w:rPr>
-              <w:t xml:space="preserve">DRAFT — confirm or edit:</w:t>
-            </w:r>
-            <w:r>
-              <w:t xml:space="preserve"> </w:t>
-            </w:r>
-            <w:r>
-              <w:t xml:space="preserve">Ran</w:t>
+              <w:t xml:space="preserve">and</w:t>
             </w:r>
             <w:r>
               <w:t xml:space="preserve"> </w:t>
@@ -287,22 +241,7 @@
               <w:rPr>
                 <w:rStyle w:val="VerbatimChar"/>
               </w:rPr>
-              <w:t xml:space="preserve">week2/tests/run_tests.sh</w:t>
-            </w:r>
-            <w:r>
-              <w:t xml:space="preserve"> </w:t>
-            </w:r>
-            <w:r>
-              <w:t xml:space="preserve">and</w:t>
-            </w:r>
-            <w:r>
-              <w:t xml:space="preserve"> </w:t>
-            </w:r>
-            <w:r>
-              <w:rPr>
-                <w:rStyle w:val="VerbatimChar"/>
-              </w:rPr>
-              <w:t xml:space="preserve">week3/integration/run_full_pipeline.sh</w:t>
+              <w:t xml:space="preserve">student_implementation/run_full_pipeline.sh</w:t>
             </w:r>
             <w:r>
               <w:t xml:space="preserve"> </w:t>
@@ -333,16 +272,6 @@
               <w:pStyle w:val="Compact"/>
               <w:jc w:val="left"/>
             </w:pPr>
-            <w:r>
-              <w:rPr>
-                <w:b/>
-                <w:bCs/>
-              </w:rPr>
-              <w:t xml:space="preserve">DRAFT — confirm or edit:</w:t>
-            </w:r>
-            <w:r>
-              <w:t xml:space="preserve"> </w:t>
-            </w:r>
             <w:r>
               <w:t xml:space="preserve">The overall Deliverable Compliance Checklist status across all four weekly reports — which items are genuinely done versus which remain team-only actions (hosted repo push, individual commits, seed confirmation) — and made sure the final report’s Limitations section (VI) states all of them honestly rather than omitting the inconvenient ones.</w:t>
             </w:r>
@@ -410,16 +339,6 @@
               <w:jc w:val="left"/>
             </w:pPr>
             <w:r>
-              <w:rPr>
-                <w:b/>
-                <w:bCs/>
-              </w:rPr>
-              <w:t xml:space="preserve">DRAFT — confirm or edit:</w:t>
-            </w:r>
-            <w:r>
-              <w:t xml:space="preserve"> </w:t>
-            </w:r>
-            <w:r>
               <w:t xml:space="preserve">Section I (Introduction), Section VII (Individual Contributions), Section VIII (Conclusion), and overall document assembly/integration across Sections II–VI drawing on the other three leads’ material.</w:t>
             </w:r>
           </w:p>
@@ -445,16 +364,6 @@
               <w:pStyle w:val="Compact"/>
               <w:jc w:val="left"/>
             </w:pPr>
-            <w:r>
-              <w:rPr>
-                <w:b/>
-                <w:bCs/>
-              </w:rPr>
-              <w:t xml:space="preserve">DRAFT — confirm or edit:</w:t>
-            </w:r>
-            <w:r>
-              <w:t xml:space="preserve"> </w:t>
-            </w:r>
             <w:r>
               <w:rPr>
                 <w:i/>
@@ -512,39 +421,6 @@
         </w:tc>
       </w:tr>
     </w:tbl>
-    <w:p>
-      <w:pPr>
-        <w:pStyle w:val="BodyText"/>
-      </w:pPr>
-      <w:r>
-        <w:rPr>
-          <w:b/>
-          <w:bCs/>
-        </w:rPr>
-        <w:t xml:space="preserve">Before signing:</w:t>
-      </w:r>
-      <w:r>
-        <w:t xml:space="preserve"> </w:t>
-      </w:r>
-      <w:r>
-        <w:t xml:space="preserve">re-read</w:t>
-      </w:r>
-      <w:r>
-        <w:t xml:space="preserve"> </w:t>
-      </w:r>
-      <w:r>
-        <w:rPr>
-          <w:rStyle w:val="VerbatimChar"/>
-        </w:rPr>
-        <w:t xml:space="preserve">week1/ai_use_declaration/ai_use_log.md</w:t>
-      </w:r>
-      <w:r>
-        <w:t xml:space="preserve"> </w:t>
-      </w:r>
-      <w:r>
-        <w:t xml:space="preserve">in full — a large share of the artefacts listed above were AI-assisted in first draft, and this form’s honesty depends on you having personally reviewed, understood, and where needed corrected them, not merely claiming authorship of AI output.</w:t>
-      </w:r>
-    </w:p>
     <w:p>
       <w:pPr>
         <w:pStyle w:val="BodyText"/>

</xml_diff>